<commit_message>
feat(panel-5): add slots, candidates Chinmay Patil, Kalpak Yawalkar, Naman, fix 2nd dept preferences
</commit_message>
<xml_diff>
--- a/Panel 5.docx
+++ b/Panel 5.docx
@@ -1,429 +1,415 @@
 
 <file path=word/document.xml><?xml version="1.0" encoding="utf-8"?>
-<w:document xmlns:wpc="http://schemas.microsoft.com/office/word/2010/wordprocessingCanvas" xmlns:cx="http://schemas.microsoft.com/office/drawing/2014/chartex" xmlns:cx1="http://schemas.microsoft.com/office/drawing/2015/9/8/chartex" xmlns:cx2="http://schemas.microsoft.com/office/drawing/2015/10/21/chartex" xmlns:cx3="http://schemas.microsoft.com/office/drawing/2016/5/9/chartex" xmlns:cx4="http://schemas.microsoft.com/office/drawing/2016/5/10/chartex" xmlns:cx5="http://schemas.microsoft.com/office/drawing/2016/5/11/chartex" xmlns:cx6="http://schemas.microsoft.com/office/drawing/2016/5/12/chartex" xmlns:cx7="http://schemas.microsoft.com/office/drawing/2016/5/13/chartex" xmlns:cx8="http://schemas.microsoft.com/office/drawing/2016/5/14/chartex" xmlns:mc="http://schemas.openxmlformats.org/markup-compatibility/2006" xmlns:aink="http://schemas.microsoft.com/office/drawing/2016/ink" xmlns:am3d="http://schemas.microsoft.com/office/drawing/2017/model3d" xmlns:o="urn:schemas-microsoft-com:office:office" xmlns:oel="http://schemas.microsoft.com/office/2019/extlst" xmlns:r="http://schemas.openxmlformats.org/officeDocument/2006/relationships" xmlns:m="http://schemas.openxmlformats.org/officeDocument/2006/math" xmlns:v="urn:schemas-microsoft-com:vml" xmlns:wp14="http://schemas.microsoft.com/office/word/2010/wordprocessingDrawing" xmlns:wp="http://schemas.openxmlformats.org/drawingml/2006/wordprocessingDrawing" xmlns:w10="urn:schemas-microsoft-com:office:word" xmlns:w="http://schemas.openxmlformats.org/wordprocessingml/2006/main" xmlns:w14="http://schemas.microsoft.com/office/word/2010/wordml" xmlns:w15="http://schemas.microsoft.com/office/word/2012/wordml" xmlns:w16cex="http://schemas.microsoft.com/office/word/2018/wordml/cex" xmlns:w16cid="http://schemas.microsoft.com/office/word/2016/wordml/cid" xmlns:w16="http://schemas.microsoft.com/office/word/2018/wordml" xmlns:w16du="http://schemas.microsoft.com/office/word/2023/wordml/word16du" xmlns:w16sdtdh="http://schemas.microsoft.com/office/word/2020/wordml/sdtdatahash" xmlns:w16sdtfl="http://schemas.microsoft.com/office/word/2024/wordml/sdtformatlock" xmlns:w16se="http://schemas.microsoft.com/office/word/2015/wordml/symex" xmlns:wpg="http://schemas.microsoft.com/office/word/2010/wordprocessingGroup" xmlns:wpi="http://schemas.microsoft.com/office/word/2010/wordprocessingInk" xmlns:wne="http://schemas.microsoft.com/office/word/2006/wordml" xmlns:wps="http://schemas.microsoft.com/office/word/2010/wordprocessingShape" mc:Ignorable="w14 w15 w16se w16cid w16 w16cex w16sdtdh w16sdtfl w16du wp14">
+<w:document xmlns:wpc="http://schemas.microsoft.com/office/word/2010/wordprocessingCanvas" xmlns:mc="http://schemas.openxmlformats.org/markup-compatibility/2006" xmlns:o="urn:schemas-microsoft-com:office:office" xmlns:r="http://schemas.openxmlformats.org/officeDocument/2006/relationships" xmlns:m="http://schemas.openxmlformats.org/officeDocument/2006/math" xmlns:v="urn:schemas-microsoft-com:vml" xmlns:wp14="http://schemas.microsoft.com/office/word/2010/wordprocessingDrawing" xmlns:wp="http://schemas.openxmlformats.org/drawingml/2006/wordprocessingDrawing" xmlns:w10="urn:schemas-microsoft-com:office:word" xmlns:w="http://schemas.openxmlformats.org/wordprocessingml/2006/main" xmlns:w14="http://schemas.microsoft.com/office/word/2010/wordml" xmlns:w15="http://schemas.microsoft.com/office/word/2012/wordml" xmlns:w16se="http://schemas.microsoft.com/office/word/2015/wordml/symex" xmlns:w16cid="http://schemas.microsoft.com/office/word/2016/wordml/cid" xmlns:w16="http://schemas.microsoft.com/office/word/2018/wordml" xmlns:w16cex="http://schemas.microsoft.com/office/word/2018/wordml/cex" xmlns:w16sdtdh="http://schemas.microsoft.com/office/word/2020/wordml/sdtdatahash" xmlns:wne="http://schemas.microsoft.com/office/word/2006/wordml" xmlns:wpg="http://schemas.microsoft.com/office/word/2010/wordprocessingGroup" xmlns:wps="http://schemas.microsoft.com/office/word/2010/wordprocessingShape" mc:Ignorable="w14 w15 w16se w16cid w16 w16cex w16sdtdh wp14">
   <w:body>
     <w:p>
-      <w:pPr>
-        <w:rPr>
-          <w:lang w:val="en-US"/>
-        </w:rPr>
-      </w:pPr>
-      <w:r>
-        <w:rPr>
-          <w:lang w:val="en-US"/>
+      <w:r>
+        <w:rPr>
+          <w:rFonts w:ascii="Aptos" w:hAnsi="Aptos" w:eastAsia="Aptos" w:cs="Aptos" w:asciiTheme="minorHAnsi" w:hAnsiTheme="minorHAnsi" w:eastAsiaTheme="minorHAnsi" w:csTheme="minorBidi"/>
+          <w:kern w:val="2"/>
+          <w:sz w:val="24"/>
+          <w:szCs w:val="24"/>
         </w:rPr>
         <w:t>Panel 5</w:t>
       </w:r>
     </w:p>
     <w:p>
-      <w:pPr>
-        <w:rPr>
-          <w:lang w:val="en-US"/>
-        </w:rPr>
-      </w:pPr>
-      <w:r>
-        <w:rPr>
-          <w:lang w:val="en-US"/>
+      <w:r>
+        <w:rPr>
+          <w:rFonts w:ascii="Aptos" w:hAnsi="Aptos" w:eastAsia="Aptos" w:cs="Aptos" w:asciiTheme="minorHAnsi" w:hAnsiTheme="minorHAnsi" w:eastAsiaTheme="minorHAnsi" w:csTheme="minorBidi"/>
+          <w:kern w:val="2"/>
+          <w:sz w:val="24"/>
+          <w:szCs w:val="24"/>
         </w:rPr>
         <w:t>9:30-10:00pm</w:t>
       </w:r>
       <w:r>
-        <w:rPr>
-          <w:lang w:val="en-US"/>
-        </w:rPr>
-        <w:br/>
-        <w:t xml:space="preserve">Salah </w:t>
-      </w:r>
-      <w:proofErr w:type="spellStart"/>
-      <w:r>
-        <w:rPr>
-          <w:lang w:val="en-US"/>
-        </w:rPr>
-        <w:t>Amjad</w:t>
-      </w:r>
-      <w:proofErr w:type="spellEnd"/>
-      <w:r>
-        <w:rPr>
-          <w:lang w:val="en-US"/>
-        </w:rPr>
-        <w:t xml:space="preserve"> </w:t>
-      </w:r>
-      <w:proofErr w:type="spellStart"/>
-      <w:r>
-        <w:rPr>
-          <w:lang w:val="en-US"/>
-        </w:rPr>
-        <w:t>Zingu</w:t>
-      </w:r>
-      <w:proofErr w:type="spellEnd"/>
-      <w:r>
-        <w:rPr>
-          <w:lang w:val="en-US"/>
-        </w:rPr>
-        <w:br/>
-      </w:r>
-      <w:proofErr w:type="spellStart"/>
-      <w:r>
-        <w:rPr>
-          <w:lang w:val="en-US"/>
-        </w:rPr>
-        <w:t>Imaad</w:t>
-      </w:r>
-      <w:proofErr w:type="spellEnd"/>
-      <w:r>
-        <w:rPr>
-          <w:lang w:val="en-US"/>
-        </w:rPr>
-        <w:t xml:space="preserve"> </w:t>
-      </w:r>
-      <w:proofErr w:type="spellStart"/>
-      <w:r>
-        <w:rPr>
-          <w:lang w:val="en-US"/>
-        </w:rPr>
-        <w:t>Khot</w:t>
-      </w:r>
-      <w:proofErr w:type="spellEnd"/>
-      <w:r>
-        <w:rPr>
-          <w:lang w:val="en-US"/>
-        </w:rPr>
-        <w:br/>
-        <w:t xml:space="preserve">Shiv Rajiv </w:t>
-      </w:r>
-      <w:proofErr w:type="spellStart"/>
-      <w:r>
-        <w:rPr>
-          <w:lang w:val="en-US"/>
-        </w:rPr>
-        <w:t>Pimpale</w:t>
-      </w:r>
-      <w:proofErr w:type="spellEnd"/>
-      <w:r>
-        <w:rPr>
-          <w:lang w:val="en-US"/>
-        </w:rPr>
-        <w:br/>
-        <w:t xml:space="preserve">Aditya </w:t>
-      </w:r>
-      <w:proofErr w:type="spellStart"/>
-      <w:r>
-        <w:rPr>
-          <w:lang w:val="en-US"/>
-        </w:rPr>
-        <w:t>Upadhyay</w:t>
-      </w:r>
-      <w:proofErr w:type="spellEnd"/>
-      <w:r>
-        <w:rPr>
-          <w:lang w:val="en-US"/>
-        </w:rPr>
-        <w:br/>
-      </w:r>
-      <w:proofErr w:type="spellStart"/>
-      <w:r>
-        <w:rPr>
-          <w:lang w:val="en-US"/>
-        </w:rPr>
-        <w:t>Ojas</w:t>
-      </w:r>
-      <w:proofErr w:type="spellEnd"/>
-      <w:r>
-        <w:rPr>
-          <w:lang w:val="en-US"/>
-        </w:rPr>
-        <w:t xml:space="preserve"> Londhe</w:t>
+        <w:br w:type="textWrapping"/>
+      </w:r>
+      <w:r>
+        <w:rPr>
+          <w:rFonts w:ascii="Aptos" w:hAnsi="Aptos" w:eastAsia="Aptos" w:cs="Aptos" w:asciiTheme="minorHAnsi" w:hAnsiTheme="minorHAnsi" w:eastAsiaTheme="minorHAnsi" w:csTheme="minorBidi"/>
+          <w:kern w:val="2"/>
+          <w:sz w:val="24"/>
+          <w:szCs w:val="24"/>
+        </w:rPr>
+        <w:t>Salah Amjad Zingu</w:t>
+      </w:r>
+      <w:r>
+        <w:br w:type="textWrapping"/>
+      </w:r>
+      <w:r>
+        <w:rPr>
+          <w:rFonts w:ascii="Aptos" w:hAnsi="Aptos" w:eastAsia="Aptos" w:cs="Aptos" w:asciiTheme="minorHAnsi" w:hAnsiTheme="minorHAnsi" w:eastAsiaTheme="minorHAnsi" w:csTheme="minorBidi"/>
+          <w:kern w:val="2"/>
+          <w:sz w:val="24"/>
+          <w:szCs w:val="24"/>
+        </w:rPr>
+        <w:t>Imaad Khot</w:t>
+      </w:r>
+      <w:r>
+        <w:br w:type="textWrapping"/>
+      </w:r>
+      <w:r>
+        <w:rPr>
+          <w:rFonts w:ascii="Aptos" w:hAnsi="Aptos" w:eastAsia="Aptos" w:cs="Aptos" w:asciiTheme="minorHAnsi" w:hAnsiTheme="minorHAnsi" w:eastAsiaTheme="minorHAnsi" w:csTheme="minorBidi"/>
+          <w:kern w:val="2"/>
+          <w:sz w:val="24"/>
+          <w:szCs w:val="24"/>
+        </w:rPr>
+        <w:t>Shiv Rajiv Pimpale</w:t>
+      </w:r>
+      <w:r>
+        <w:br w:type="textWrapping"/>
+      </w:r>
+      <w:r>
+        <w:rPr>
+          <w:rFonts w:ascii="Aptos" w:hAnsi="Aptos" w:eastAsia="Aptos" w:cs="Aptos" w:asciiTheme="minorHAnsi" w:hAnsiTheme="minorHAnsi" w:eastAsiaTheme="minorHAnsi" w:csTheme="minorBidi"/>
+          <w:kern w:val="2"/>
+          <w:sz w:val="24"/>
+          <w:szCs w:val="24"/>
+        </w:rPr>
+        <w:t>Aditya Upadhyay</w:t>
+      </w:r>
+      <w:r>
+        <w:br w:type="textWrapping"/>
+      </w:r>
+      <w:r>
+        <w:rPr>
+          <w:rFonts w:ascii="Aptos" w:hAnsi="Aptos" w:eastAsia="Aptos" w:cs="Aptos" w:asciiTheme="minorHAnsi" w:hAnsiTheme="minorHAnsi" w:eastAsiaTheme="minorHAnsi" w:csTheme="minorBidi"/>
+          <w:kern w:val="2"/>
+          <w:sz w:val="24"/>
+          <w:szCs w:val="24"/>
+        </w:rPr>
+        <w:t>Ojas Londhe</w:t>
       </w:r>
     </w:p>
     <w:p>
-      <w:pPr>
-        <w:rPr>
-          <w:lang w:val="en-US"/>
-        </w:rPr>
-      </w:pPr>
-      <w:r>
-        <w:rPr>
-          <w:lang w:val="en-US"/>
+      <w:r>
+        <w:rPr>
+          <w:rFonts w:ascii="Aptos" w:hAnsi="Aptos" w:eastAsia="Aptos" w:cs="Aptos" w:asciiTheme="minorHAnsi" w:hAnsiTheme="minorHAnsi" w:eastAsiaTheme="minorHAnsi" w:csTheme="minorBidi"/>
+          <w:kern w:val="2"/>
+          <w:sz w:val="24"/>
+          <w:szCs w:val="24"/>
         </w:rPr>
         <w:t>10:00-10:30pm</w:t>
       </w:r>
       <w:r>
-        <w:rPr>
-          <w:lang w:val="en-US"/>
-        </w:rPr>
-        <w:br/>
+        <w:br w:type="textWrapping"/>
+      </w:r>
+      <w:r>
+        <w:rPr>
+          <w:rFonts w:ascii="Aptos" w:hAnsi="Aptos" w:eastAsia="Aptos" w:cs="Aptos" w:asciiTheme="minorHAnsi" w:hAnsiTheme="minorHAnsi" w:eastAsiaTheme="minorHAnsi" w:csTheme="minorBidi"/>
+          <w:kern w:val="2"/>
+          <w:sz w:val="24"/>
+          <w:szCs w:val="24"/>
+        </w:rPr>
         <w:t>Om Mahendra Gawde</w:t>
       </w:r>
       <w:r>
-        <w:rPr>
-          <w:lang w:val="en-US"/>
-        </w:rPr>
-        <w:br/>
+        <w:br w:type="textWrapping"/>
+      </w:r>
+      <w:r>
+        <w:rPr>
+          <w:rFonts w:ascii="Aptos" w:hAnsi="Aptos" w:eastAsia="Aptos" w:cs="Aptos" w:asciiTheme="minorHAnsi" w:hAnsiTheme="minorHAnsi" w:eastAsiaTheme="minorHAnsi" w:csTheme="minorBidi"/>
+          <w:kern w:val="2"/>
+          <w:sz w:val="24"/>
+          <w:szCs w:val="24"/>
+        </w:rPr>
         <w:t>Harshid Modi</w:t>
       </w:r>
       <w:r>
-        <w:rPr>
-          <w:lang w:val="en-US"/>
-        </w:rPr>
-        <w:br/>
+        <w:br w:type="textWrapping"/>
+      </w:r>
+      <w:r>
+        <w:rPr>
+          <w:rFonts w:ascii="Aptos" w:hAnsi="Aptos" w:eastAsia="Aptos" w:cs="Aptos" w:asciiTheme="minorHAnsi" w:hAnsiTheme="minorHAnsi" w:eastAsiaTheme="minorHAnsi" w:csTheme="minorBidi"/>
+          <w:kern w:val="2"/>
+          <w:sz w:val="24"/>
+          <w:szCs w:val="24"/>
+        </w:rPr>
         <w:t>Kalidindi Hashvanth Venkata Siva Ram</w:t>
       </w:r>
       <w:r>
-        <w:rPr>
-          <w:lang w:val="en-US"/>
-        </w:rPr>
-        <w:br/>
+        <w:br w:type="textWrapping"/>
+      </w:r>
+      <w:r>
+        <w:rPr>
+          <w:rFonts w:ascii="Aptos" w:hAnsi="Aptos" w:eastAsia="Aptos" w:cs="Aptos" w:asciiTheme="minorHAnsi" w:hAnsiTheme="minorHAnsi" w:eastAsiaTheme="minorHAnsi" w:csTheme="minorBidi"/>
+          <w:kern w:val="2"/>
+          <w:sz w:val="24"/>
+          <w:szCs w:val="24"/>
+        </w:rPr>
         <w:t>Ishan Sachin Vaidya</w:t>
       </w:r>
       <w:r>
-        <w:rPr>
-          <w:lang w:val="en-US"/>
-        </w:rPr>
-        <w:br/>
+        <w:br w:type="textWrapping"/>
+      </w:r>
+      <w:r>
+        <w:rPr>
+          <w:rFonts w:ascii="Aptos" w:hAnsi="Aptos" w:eastAsia="Aptos" w:cs="Aptos" w:asciiTheme="minorHAnsi" w:hAnsiTheme="minorHAnsi" w:eastAsiaTheme="minorHAnsi" w:csTheme="minorBidi"/>
+          <w:kern w:val="2"/>
+          <w:sz w:val="24"/>
+          <w:szCs w:val="24"/>
+        </w:rPr>
         <w:t>Vikram Sawant</w:t>
       </w:r>
     </w:p>
     <w:p>
-      <w:pPr>
-        <w:rPr>
-          <w:lang w:val="en-US"/>
-        </w:rPr>
-      </w:pPr>
-      <w:r>
-        <w:rPr>
-          <w:lang w:val="en-US"/>
+      <w:r>
+        <w:rPr>
+          <w:rFonts w:ascii="Aptos" w:hAnsi="Aptos" w:eastAsia="Aptos" w:cs="Aptos" w:asciiTheme="minorHAnsi" w:hAnsiTheme="minorHAnsi" w:eastAsiaTheme="minorHAnsi" w:csTheme="minorBidi"/>
+          <w:kern w:val="2"/>
+          <w:sz w:val="24"/>
+          <w:szCs w:val="24"/>
         </w:rPr>
         <w:t>10:30-11:00pm</w:t>
       </w:r>
       <w:r>
-        <w:rPr>
-          <w:lang w:val="en-US"/>
-        </w:rPr>
-        <w:br/>
+        <w:br w:type="textWrapping"/>
+      </w:r>
+      <w:r>
+        <w:rPr>
+          <w:rFonts w:ascii="Aptos" w:hAnsi="Aptos" w:eastAsia="Aptos" w:cs="Aptos" w:asciiTheme="minorHAnsi" w:hAnsiTheme="minorHAnsi" w:eastAsiaTheme="minorHAnsi" w:csTheme="minorBidi"/>
+          <w:kern w:val="2"/>
+          <w:sz w:val="24"/>
+          <w:szCs w:val="24"/>
+        </w:rPr>
         <w:t>Anushka Giri</w:t>
       </w:r>
       <w:r>
-        <w:rPr>
-          <w:lang w:val="en-US"/>
-        </w:rPr>
-        <w:br/>
-      </w:r>
-      <w:proofErr w:type="spellStart"/>
-      <w:r>
-        <w:rPr>
-          <w:lang w:val="en-US"/>
-        </w:rPr>
-        <w:t>Avishi</w:t>
-      </w:r>
-      <w:proofErr w:type="spellEnd"/>
-      <w:r>
-        <w:rPr>
-          <w:lang w:val="en-US"/>
-        </w:rPr>
-        <w:t xml:space="preserve"> </w:t>
-      </w:r>
-      <w:proofErr w:type="spellStart"/>
-      <w:r>
-        <w:rPr>
-          <w:lang w:val="en-US"/>
-        </w:rPr>
-        <w:t>Puhani</w:t>
-      </w:r>
-      <w:proofErr w:type="spellEnd"/>
-      <w:r>
-        <w:rPr>
-          <w:lang w:val="en-US"/>
-        </w:rPr>
-        <w:br/>
-      </w:r>
-      <w:proofErr w:type="spellStart"/>
-      <w:r>
-        <w:rPr>
-          <w:lang w:val="en-US"/>
-        </w:rPr>
-        <w:t>Khemani</w:t>
-      </w:r>
-      <w:proofErr w:type="spellEnd"/>
-      <w:r>
-        <w:rPr>
-          <w:lang w:val="en-US"/>
-        </w:rPr>
-        <w:t xml:space="preserve"> Riya</w:t>
-      </w:r>
-      <w:r>
-        <w:rPr>
-          <w:lang w:val="en-US"/>
-        </w:rPr>
-        <w:br/>
+        <w:br w:type="textWrapping"/>
+      </w:r>
+      <w:r>
+        <w:rPr>
+          <w:rFonts w:ascii="Aptos" w:hAnsi="Aptos" w:eastAsia="Aptos" w:cs="Aptos" w:asciiTheme="minorHAnsi" w:hAnsiTheme="minorHAnsi" w:eastAsiaTheme="minorHAnsi" w:csTheme="minorBidi"/>
+          <w:kern w:val="2"/>
+          <w:sz w:val="24"/>
+          <w:szCs w:val="24"/>
+        </w:rPr>
+        <w:t>Avishi Puhani</w:t>
+      </w:r>
+      <w:r>
+        <w:br w:type="textWrapping"/>
+      </w:r>
+      <w:r>
+        <w:rPr>
+          <w:rFonts w:ascii="Aptos" w:hAnsi="Aptos" w:eastAsia="Aptos" w:cs="Aptos" w:asciiTheme="minorHAnsi" w:hAnsiTheme="minorHAnsi" w:eastAsiaTheme="minorHAnsi" w:csTheme="minorBidi"/>
+          <w:kern w:val="2"/>
+          <w:sz w:val="24"/>
+          <w:szCs w:val="24"/>
+        </w:rPr>
+        <w:t>Khemani Riya</w:t>
+      </w:r>
+      <w:r>
+        <w:br w:type="textWrapping"/>
+      </w:r>
+      <w:r>
+        <w:rPr>
+          <w:rFonts w:ascii="Aptos" w:hAnsi="Aptos" w:eastAsia="Aptos" w:cs="Aptos" w:asciiTheme="minorHAnsi" w:hAnsiTheme="minorHAnsi" w:eastAsiaTheme="minorHAnsi" w:csTheme="minorBidi"/>
+          <w:kern w:val="2"/>
+          <w:sz w:val="24"/>
+          <w:szCs w:val="24"/>
+        </w:rPr>
         <w:t>Tanisha Ratnaparkhi</w:t>
       </w:r>
       <w:r>
-        <w:rPr>
-          <w:lang w:val="en-US"/>
-        </w:rPr>
-        <w:br/>
+        <w:br w:type="textWrapping"/>
+      </w:r>
+      <w:r>
+        <w:rPr>
+          <w:rFonts w:ascii="Aptos" w:hAnsi="Aptos" w:eastAsia="Aptos" w:cs="Aptos" w:asciiTheme="minorHAnsi" w:hAnsiTheme="minorHAnsi" w:eastAsiaTheme="minorHAnsi" w:csTheme="minorBidi"/>
+          <w:kern w:val="2"/>
+          <w:sz w:val="24"/>
+          <w:szCs w:val="24"/>
+        </w:rPr>
         <w:t>Ipshita Suman</w:t>
       </w:r>
     </w:p>
     <w:p>
-      <w:pPr>
-        <w:rPr>
-          <w:lang w:val="en-US"/>
-        </w:rPr>
-      </w:pPr>
-      <w:r>
-        <w:rPr>
-          <w:lang w:val="en-US"/>
+      <w:r>
+        <w:rPr>
+          <w:rFonts w:ascii="Aptos" w:hAnsi="Aptos" w:eastAsia="Aptos" w:cs="Aptos" w:asciiTheme="minorHAnsi" w:hAnsiTheme="minorHAnsi" w:eastAsiaTheme="minorHAnsi" w:csTheme="minorBidi"/>
+          <w:kern w:val="2"/>
+          <w:sz w:val="24"/>
+          <w:szCs w:val="24"/>
         </w:rPr>
         <w:t>11:00-11:30pm</w:t>
       </w:r>
       <w:r>
-        <w:rPr>
-          <w:lang w:val="en-US"/>
-        </w:rPr>
-        <w:br/>
+        <w:br w:type="textWrapping"/>
+      </w:r>
+      <w:r>
+        <w:rPr>
+          <w:rFonts w:ascii="Aptos" w:hAnsi="Aptos" w:eastAsia="Aptos" w:cs="Aptos" w:asciiTheme="minorHAnsi" w:hAnsiTheme="minorHAnsi" w:eastAsiaTheme="minorHAnsi" w:csTheme="minorBidi"/>
+          <w:kern w:val="2"/>
+          <w:sz w:val="24"/>
+          <w:szCs w:val="24"/>
+        </w:rPr>
         <w:t>Harshita Ganesh Mahajan</w:t>
       </w:r>
       <w:r>
-        <w:rPr>
-          <w:lang w:val="en-US"/>
-        </w:rPr>
-        <w:br/>
+        <w:br w:type="textWrapping"/>
+      </w:r>
+      <w:r>
+        <w:rPr>
+          <w:rFonts w:ascii="Aptos" w:hAnsi="Aptos" w:eastAsia="Aptos" w:cs="Aptos" w:asciiTheme="minorHAnsi" w:hAnsiTheme="minorHAnsi" w:eastAsiaTheme="minorHAnsi" w:csTheme="minorBidi"/>
+          <w:kern w:val="2"/>
+          <w:sz w:val="24"/>
+          <w:szCs w:val="24"/>
+        </w:rPr>
         <w:t>Mansi Ketan Landge</w:t>
       </w:r>
       <w:r>
-        <w:rPr>
-          <w:lang w:val="en-US"/>
-        </w:rPr>
-        <w:br/>
+        <w:br w:type="textWrapping"/>
+      </w:r>
+      <w:r>
+        <w:rPr>
+          <w:rFonts w:ascii="Aptos" w:hAnsi="Aptos" w:eastAsia="Aptos" w:cs="Aptos" w:asciiTheme="minorHAnsi" w:hAnsiTheme="minorHAnsi" w:eastAsiaTheme="minorHAnsi" w:csTheme="minorBidi"/>
+          <w:kern w:val="2"/>
+          <w:sz w:val="24"/>
+          <w:szCs w:val="24"/>
+        </w:rPr>
         <w:t>Dhruv Jagtap</w:t>
       </w:r>
       <w:r>
-        <w:rPr>
-          <w:lang w:val="en-US"/>
-        </w:rPr>
-        <w:br/>
+        <w:br w:type="textWrapping"/>
+      </w:r>
+      <w:r>
+        <w:rPr>
+          <w:rFonts w:ascii="Aptos" w:hAnsi="Aptos" w:eastAsia="Aptos" w:cs="Aptos" w:asciiTheme="minorHAnsi" w:hAnsiTheme="minorHAnsi" w:eastAsiaTheme="minorHAnsi" w:csTheme="minorBidi"/>
+          <w:kern w:val="2"/>
+          <w:sz w:val="24"/>
+          <w:szCs w:val="24"/>
+        </w:rPr>
         <w:t>Shreyas Patre</w:t>
       </w:r>
       <w:r>
-        <w:rPr>
-          <w:lang w:val="en-US"/>
-        </w:rPr>
-        <w:br/>
-      </w:r>
-      <w:r>
-        <w:rPr>
-          <w:lang w:val="en-US"/>
+        <w:br w:type="textWrapping"/>
+      </w:r>
+      <w:r>
+        <w:rPr>
+          <w:rFonts w:ascii="Aptos" w:hAnsi="Aptos" w:eastAsia="Aptos" w:cs="Aptos" w:asciiTheme="minorHAnsi" w:hAnsiTheme="minorHAnsi" w:eastAsiaTheme="minorHAnsi" w:csTheme="minorBidi"/>
+          <w:kern w:val="2"/>
+          <w:sz w:val="24"/>
+          <w:szCs w:val="24"/>
         </w:rPr>
         <w:t>Kamlesh Gajanan Varma</w:t>
       </w:r>
     </w:p>
     <w:p>
-      <w:pPr>
-        <w:rPr>
-          <w:lang w:val="en-US"/>
-        </w:rPr>
-      </w:pPr>
-      <w:r>
-        <w:rPr>
-          <w:lang w:val="en-US"/>
+      <w:r>
+        <w:rPr>
+          <w:rFonts w:ascii="Aptos" w:hAnsi="Aptos" w:eastAsia="Aptos" w:cs="Aptos" w:asciiTheme="minorHAnsi" w:hAnsiTheme="minorHAnsi" w:eastAsiaTheme="minorHAnsi" w:csTheme="minorBidi"/>
+          <w:kern w:val="2"/>
+          <w:sz w:val="24"/>
+          <w:szCs w:val="24"/>
         </w:rPr>
         <w:t>11:30-12:00pm</w:t>
       </w:r>
       <w:r>
-        <w:rPr>
-          <w:lang w:val="en-US"/>
-        </w:rPr>
-        <w:br/>
+        <w:br w:type="textWrapping"/>
+      </w:r>
+      <w:r>
+        <w:rPr>
+          <w:rFonts w:ascii="Aptos" w:hAnsi="Aptos" w:eastAsia="Aptos" w:cs="Aptos" w:asciiTheme="minorHAnsi" w:hAnsiTheme="minorHAnsi" w:eastAsiaTheme="minorHAnsi" w:csTheme="minorBidi"/>
+          <w:kern w:val="2"/>
+          <w:sz w:val="24"/>
+          <w:szCs w:val="24"/>
+        </w:rPr>
         <w:t>Garima Choudhari</w:t>
       </w:r>
       <w:r>
-        <w:rPr>
-          <w:lang w:val="en-US"/>
-        </w:rPr>
-        <w:br/>
+        <w:br w:type="textWrapping"/>
+      </w:r>
+      <w:r>
+        <w:rPr>
+          <w:rFonts w:ascii="Aptos" w:hAnsi="Aptos" w:eastAsia="Aptos" w:cs="Aptos" w:asciiTheme="minorHAnsi" w:hAnsiTheme="minorHAnsi" w:eastAsiaTheme="minorHAnsi" w:csTheme="minorBidi"/>
+          <w:kern w:val="2"/>
+          <w:sz w:val="24"/>
+          <w:szCs w:val="24"/>
+        </w:rPr>
         <w:t>Bhakti Sharma</w:t>
       </w:r>
       <w:r>
-        <w:rPr>
-          <w:lang w:val="en-US"/>
-        </w:rPr>
-        <w:br/>
-      </w:r>
-      <w:proofErr w:type="spellStart"/>
-      <w:r>
-        <w:rPr>
-          <w:lang w:val="en-US"/>
-        </w:rPr>
-        <w:t>Shivam</w:t>
-      </w:r>
-      <w:proofErr w:type="spellEnd"/>
-      <w:r>
-        <w:rPr>
-          <w:lang w:val="en-US"/>
-        </w:rPr>
-        <w:t xml:space="preserve"> </w:t>
-      </w:r>
-      <w:proofErr w:type="spellStart"/>
-      <w:r>
-        <w:rPr>
-          <w:lang w:val="en-US"/>
-        </w:rPr>
-        <w:t>Morbale</w:t>
-      </w:r>
-      <w:proofErr w:type="spellEnd"/>
-      <w:r>
-        <w:rPr>
-          <w:lang w:val="en-US"/>
-        </w:rPr>
-        <w:br/>
-      </w:r>
-      <w:proofErr w:type="spellStart"/>
-      <w:r>
-        <w:rPr>
-          <w:lang w:val="en-US"/>
-        </w:rPr>
-        <w:t>Sanskruti</w:t>
-      </w:r>
-      <w:proofErr w:type="spellEnd"/>
-      <w:r>
-        <w:rPr>
-          <w:lang w:val="en-US"/>
-        </w:rPr>
-        <w:t xml:space="preserve"> Sanjay </w:t>
-      </w:r>
-      <w:proofErr w:type="spellStart"/>
-      <w:r>
-        <w:rPr>
-          <w:lang w:val="en-US"/>
-        </w:rPr>
-        <w:t>Chavan</w:t>
-      </w:r>
-      <w:proofErr w:type="spellEnd"/>
-      <w:r>
-        <w:rPr>
-          <w:lang w:val="en-US"/>
-        </w:rPr>
-        <w:br/>
+        <w:br w:type="textWrapping"/>
+      </w:r>
+      <w:r>
+        <w:rPr>
+          <w:rFonts w:ascii="Aptos" w:hAnsi="Aptos" w:eastAsia="Aptos" w:cs="Aptos" w:asciiTheme="minorHAnsi" w:hAnsiTheme="minorHAnsi" w:eastAsiaTheme="minorHAnsi" w:csTheme="minorBidi"/>
+          <w:kern w:val="2"/>
+          <w:sz w:val="24"/>
+          <w:szCs w:val="24"/>
+        </w:rPr>
+        <w:t>Shivam Morbale</w:t>
+      </w:r>
+      <w:r>
+        <w:br w:type="textWrapping"/>
+      </w:r>
+      <w:r>
+        <w:rPr>
+          <w:rFonts w:ascii="Aptos" w:hAnsi="Aptos" w:eastAsia="Aptos" w:cs="Aptos" w:asciiTheme="minorHAnsi" w:hAnsiTheme="minorHAnsi" w:eastAsiaTheme="minorHAnsi" w:csTheme="minorBidi"/>
+          <w:kern w:val="2"/>
+          <w:sz w:val="24"/>
+          <w:szCs w:val="24"/>
+        </w:rPr>
+        <w:t>Sanskruti Sanjay Chavan</w:t>
+      </w:r>
+      <w:r>
+        <w:br w:type="textWrapping"/>
+      </w:r>
+      <w:r>
+        <w:rPr>
+          <w:rFonts w:ascii="Aptos" w:hAnsi="Aptos" w:eastAsia="Aptos" w:cs="Aptos" w:asciiTheme="minorHAnsi" w:hAnsiTheme="minorHAnsi" w:eastAsiaTheme="minorHAnsi" w:csTheme="minorBidi"/>
+          <w:kern w:val="2"/>
+          <w:sz w:val="24"/>
+          <w:szCs w:val="24"/>
+        </w:rPr>
         <w:t>Shashank Shekhar Pal</w:t>
       </w:r>
       <w:r>
-        <w:rPr>
-          <w:lang w:val="en-US"/>
-        </w:rPr>
-        <w:br/>
-      </w:r>
-      <w:r>
-        <w:rPr>
-          <w:lang w:val="en-US"/>
-        </w:rPr>
-        <w:br/>
+        <w:br w:type="textWrapping"/>
+      </w:r>
+    </w:p>
+    <w:p>
+      <w:r>
+        <w:rPr>
+          <w:rFonts w:ascii="Aptos" w:hAnsi="Aptos" w:eastAsia="Aptos" w:cs="Aptos" w:asciiTheme="minorHAnsi" w:hAnsiTheme="minorHAnsi" w:eastAsiaTheme="minorHAnsi" w:csTheme="minorBidi"/>
+          <w:kern w:val="2"/>
+          <w:sz w:val="24"/>
+          <w:szCs w:val="24"/>
+        </w:rPr>
+        <w:t>12:00-12:30pm</w:t>
+      </w:r>
+    </w:p>
+    <w:p>
+      <w:r>
+        <w:rPr>
+          <w:rFonts w:ascii="Aptos" w:cs="Aptos"/>
+          <w:kern w:val="2"/>
+          <w:sz w:val="24"/>
+          <w:szCs w:val="24"/>
+        </w:rPr>
+        <w:t>Kalpak Pankaj Yawalkar</w:t>
+      </w:r>
+    </w:p>
+    <w:p>
+      <w:r>
+        <w:rPr>
+          <w:rFonts w:ascii="Aptos" w:hAnsi="Aptos" w:eastAsia="Aptos" w:cs="Aptos" w:asciiTheme="minorHAnsi" w:hAnsiTheme="minorHAnsi" w:eastAsiaTheme="minorHAnsi" w:csTheme="minorBidi"/>
+          <w:kern w:val="2"/>
+          <w:sz w:val="24"/>
+          <w:szCs w:val="24"/>
+        </w:rPr>
+        <w:t>Naman</w:t>
+      </w:r>
+      <w:r>
+        <w:br w:type="textWrapping"/>
       </w:r>
     </w:p>
     <w:sectPr>
       <w:pgSz w:w="11906" w:h="16838"/>
       <w:pgMar w:top="1440" w:right="1440" w:bottom="1440" w:left="1440" w:header="708" w:footer="708" w:gutter="0"/>
-      <w:cols w:space="708"/>
       <w:docGrid w:linePitch="360"/>
     </w:sectPr>
   </w:body>

</xml_diff>